<commit_message>
docs: format DOCX cleanly with standard ASCII, remove contribution matrices from both reviews
</commit_message>
<xml_diff>
--- a/docs/reviews/DA1_REVIEW_1_REPORT.docx
+++ b/docs/reviews/DA1_REVIEW_1_REPORT.docx
@@ -13,7 +13,7 @@
           <w:color w:val="1A365D"/>
           <w:sz w:val="34"/>
         </w:rPr>
-        <w:t>COURSE MINI PROJECT — REVIEW 1 REPORT (DA1)</w:t>
+        <w:t>COURSE MINI PROJECT - REVIEW 1 REPORT (DA1)</w:t>
       </w:r>
     </w:p>
     <w:p>
@@ -78,7 +78,7 @@
                 <w:color w:val="2D3748"/>
                 <w:sz w:val="17"/>
               </w:rPr>
-              <w:t>Course Component: Design Assessment 1 (DA1) — Review 1</w:t>
+              <w:t>Course Component: Design Assessment 1 (DA1) - Review 1</w:t>
             </w:r>
           </w:p>
           <w:p>
@@ -91,7 +91,7 @@
                 <w:color w:val="2D3748"/>
                 <w:sz w:val="17"/>
               </w:rPr>
-              <w:t>Authors / Team Members:</w:t>
+              <w:t>Project Title: AGENT AMAR</w:t>
             </w:r>
           </w:p>
           <w:p>
@@ -104,7 +104,7 @@
                 <w:color w:val="2D3748"/>
                 <w:sz w:val="17"/>
               </w:rPr>
-              <w:t xml:space="preserve">  • S. MIRTTUL (Roll No.: 24BRS1428) — Multi-Agent Orchestration, ML Pipeline, Loss Formalization &amp; Benchmark Evaluation</w:t>
+              <w:t>Team Members:</w:t>
             </w:r>
           </w:p>
           <w:p>
@@ -117,7 +117,20 @@
                 <w:color w:val="2D3748"/>
                 <w:sz w:val="17"/>
               </w:rPr>
-              <w:t xml:space="preserve">  • ADITYA SRIKANTH (Roll No.: 24BRS1437) — Data Ingestion, AES-256-GCM Security, Priority Engine, FCM &amp; Flutter UI</w:t>
+              <w:t xml:space="preserve">  - S. MIRTTUL (Roll No.: 24BRS1428)</w:t>
+            </w:r>
+          </w:p>
+          <w:p>
+            <w:pPr>
+              <w:spacing w:before="0" w:after="20" w:line="252" w:lineRule="auto"/>
+            </w:pPr>
+            <w:r>
+              <w:rPr>
+                <w:rFonts w:ascii="Consolas" w:hAnsi="Consolas"/>
+                <w:color w:val="2D3748"/>
+                <w:sz w:val="17"/>
+              </w:rPr>
+              <w:t xml:space="preserve">  - ADITYA SRIKANTH (Roll No.: 24BRS1437)</w:t>
             </w:r>
           </w:p>
           <w:p>
@@ -231,7 +244,7 @@
           <w:color w:val="1A365D"/>
           <w:sz w:val="26"/>
         </w:rPr>
-        <w:t>1. Problem Identification — Domain and Motivation</w:t>
+        <w:t>1. Problem Identification - Domain and Motivation</w:t>
       </w:r>
     </w:p>
     <w:p>
@@ -260,7 +273,7 @@
           <w:color w:val="2D3748"/>
           <w:sz w:val="20"/>
         </w:rPr>
-        <w:t>Electronic mail remains the foundational backbone of global professional, academic, and administrative communication. However, the exponential expansion of digital communication channels has transformed email from an asynchronous productivity tool into a primary source of cognitive exhaustion and informational paralysis. According to longitudinal market telemetry by the Radicati Group Email Statistics Report (2023–2027), over 347.3 billion emails are transmitted and received globally each day, a figure projected to surpass 392.5 billion daily emails by 2026.</w:t>
+        <w:t>Electronic mail remains the foundational backbone of global professional, academic, and administrative communication. However, the exponential expansion of digital communication channels has transformed email from an asynchronous productivity tool into a primary source of cognitive exhaustion and informational paralysis. According to longitudinal market telemetry by the Radicati Group Email Statistics Report (2023-2027), over 347.3 billion emails are transmitted and received globally each day, a figure projected to surpass 392.5 billion daily emails by 2026.</w:t>
       </w:r>
     </w:p>
     <w:p>
@@ -288,7 +301,7 @@
           <w:color w:val="2D3748"/>
           <w:sz w:val="20"/>
         </w:rPr>
-        <w:t>In university environments, higher education students, research scholars, and academic faculty receive hundreds of heterogeneous, semi-structured messages daily—ranging from critical placement recruitment deadlines, course exam circulars, and laboratory assignment submissions to marketing newsletters, social digests, and malicious phishing attempts. A survey conducted by the American Psychological Association (APA) found that 78% of enrolled university students experienced measurable anxiety directly linked to missed academic submission deadlines and buried career opportunities resulting from email clutter. Existing commercial email solutions rely on broad sender-based clustering or rigid heuristic rules; they fail to understand contextual urgency, cannot reliably parse fuzzy or relative deadlines (e.g., 'submit your clearance form by next Friday at 5:00 PM'), and do not actively escalate pending commitments to physical alert modalities.</w:t>
+        <w:t>In university environments, higher education students, research scholars, and academic faculty receive hundreds of heterogeneous, semi-structured messages daily - ranging from critical placement recruitment deadlines, course exam circulars, and laboratory assignment submissions to marketing newsletters, social digests, and malicious phishing attempts. A survey conducted by the American Psychological Association (APA) found that 78% of enrolled university students experienced measurable anxiety directly linked to missed academic submission deadlines and buried career opportunities resulting from email clutter. Existing commercial email solutions rely on broad sender-based clustering or rigid heuristic rules; they fail to understand contextual urgency, cannot reliably parse fuzzy or relative deadlines (e.g., 'submit your clearance form by next Friday at 5:00 PM'), and do not actively escalate pending commitments to physical alert modalities.</w:t>
       </w:r>
     </w:p>
     <w:p>
@@ -415,7 +428,7 @@
           <w:color w:val="2D3748"/>
           <w:sz w:val="20"/>
         </w:rPr>
-        <w:t xml:space="preserve">• Autonomous Inbox Triage Decision: </w:t>
+        <w:t xml:space="preserve">Autonomous Inbox Triage Decision: </w:t>
       </w:r>
       <w:r>
         <w:rPr>
@@ -438,7 +451,7 @@
           <w:color w:val="2D3748"/>
           <w:sz w:val="20"/>
         </w:rPr>
-        <w:t xml:space="preserve">• Action Identification &amp; Task Extraction Decision: </w:t>
+        <w:t xml:space="preserve">Action Identification &amp; Task Extraction Decision: </w:t>
       </w:r>
       <w:r>
         <w:rPr>
@@ -461,7 +474,7 @@
           <w:color w:val="2D3748"/>
           <w:sz w:val="20"/>
         </w:rPr>
-        <w:t xml:space="preserve">• Temporal Proximity &amp; Scheduling Decision: </w:t>
+        <w:t xml:space="preserve">Temporal Proximity &amp; Scheduling Decision: </w:t>
       </w:r>
       <w:r>
         <w:rPr>
@@ -484,7 +497,7 @@
           <w:color w:val="2D3748"/>
           <w:sz w:val="20"/>
         </w:rPr>
-        <w:t xml:space="preserve">• Multi-Modal Escalation &amp; Alert Decision: </w:t>
+        <w:t xml:space="preserve">Multi-Modal Escalation &amp; Alert Decision: </w:t>
       </w:r>
       <w:r>
         <w:rPr>
@@ -492,7 +505,7 @@
           <w:color w:val="2D3748"/>
           <w:sz w:val="20"/>
         </w:rPr>
-        <w:t>Evaluates a composite priority score S in [0, 100] to decide the appropriate delivery mechanism—ranging from silent inbox storage to high-priority push notifications and urgent device-level audible alarm dialogs.</w:t>
+        <w:t>Evaluates a composite priority score S in [0, 100] to decide the appropriate delivery mechanism - ranging from silent inbox storage to high-priority push notifications and urgent device-level audible alarm dialogs.</w:t>
       </w:r>
     </w:p>
     <w:p>
@@ -521,7 +534,7 @@
           <w:color w:val="2D3748"/>
           <w:sz w:val="20"/>
         </w:rPr>
-        <w:t>The literature survey examines 16 peer-reviewed research papers published in prestigious computer science venues (IEEE, ACM, Elsevier, Springer, ACL, EMNLP, NeurIPS, and ICML). Over 75% of the surveyed works (12 out of 16) were published within the last three years (2023–2025/2026), reflecting the recent transition from static supervised classifiers toward generative Large Language Models (LLMs) and autonomous multi-agent cooperative architectures.</w:t>
+        <w:t>The literature survey examines 16 peer-reviewed research papers published in prestigious computer science venues (IEEE, ACM, Elsevier, Springer, ACL, EMNLP, NeurIPS, and ICML). Over 75% of the surveyed works (12 out of 16) were published within the last three years (2023-2025/2026), reflecting the recent transition from static supervised classifiers toward generative Large Language Models (LLMs) and autonomous multi-agent cooperative architectures.</w:t>
       </w:r>
     </w:p>
     <w:p>
@@ -3444,7 +3457,7 @@
           <w:color w:val="2D3748"/>
           <w:sz w:val="20"/>
         </w:rPr>
-        <w:t>Contemporary generative AI solutions ([1], [13]) route every incoming message indiscriminately through frontier cloud-hosted LLMs. While accurate, this approach incurs substantial financial overhead (~$0.02–$0.05 per email), high network latency (&gt;1.5–3.0 seconds per call), and fails completely during network dropouts or API rate-limit exhaustion. Although cascading techniques exist ([3], [11]), they have not been applied to multi-class academic triage coupled with local, offline CPU-bound classifiers.</w:t>
+        <w:t>Contemporary generative AI solutions ([1], [13]) route every incoming message indiscriminately through frontier cloud-hosted LLMs. While accurate, this approach incurs substantial financial overhead (~$0.02-$0.05 per email), high network latency (&gt;1.5-3.0 seconds per call), and fails completely during network dropouts or API rate-limit exhaustion. Although cascading techniques exist ([3], [11]), they have not been applied to multi-class academic triage coupled with local, offline CPU-bound classifiers.</w:t>
       </w:r>
     </w:p>
     <w:p>
@@ -3542,7 +3555,7 @@
           <w:color w:val="2D3748"/>
           <w:sz w:val="20"/>
         </w:rPr>
-        <w:t>Given a continuous asynchronous stream of raw, semi-structured multi-field email messages e in E (each comprising RFC 2822 metadata, sender domain strings, unstandardized HTML/plain-text bodies up to 50,000 characters, and variable timestamp markers) arriving under severe class imbalance across 15 distinct semantic categories, the objective is to design, implement, and evaluate an autonomous multi-agent system coordinated by a deterministic orchestrator that maps each incoming email into a structured decision tuple y = &lt;c*, S, A, D, r&gt;—where c* represents the validated primary triage category, S in [0, 100] is a dynamic multi-factor priority score, A is a set of canonical imperative action items, D contains ISO-8601 UTC-grounded deadlines, and r in {store, notify, monitor, label} denotes downstream routing directives—subject to strict local privacy constraints (AES-256-GCM zero-leakage persistence), sub-5 ms local inference latency for predictable emails, and zero data loss, such that the system achieves a multi-class triage Macro-F1 &gt;= 0.90 across all 15 categories, extracts action items and deadlines with an Exact Match F1 &gt;= 0.85, and offloads at least 65% of classification volume to a local CPU-bound calibrated linear classifier without degrading top-1 decision accuracy relative to a monolithic zero-shot frontier LLM baseline (Gemini / GPT-4), while guaranteeing 100% recall on critical academic examination and campus placement alerts.</w:t>
+        <w:t>Given a continuous asynchronous stream of raw, semi-structured multi-field email messages e in E (each comprising RFC 2822 metadata, sender domain strings, unstandardized HTML/plain-text bodies up to 50,000 characters, and variable timestamp markers) arriving under severe class imbalance across 15 distinct semantic categories, the objective is to design, implement, and evaluate an autonomous multi-agent system coordinated by a deterministic orchestrator that maps each incoming email into a structured decision tuple y = &lt;c*, S, A, D, r&gt; - where c* represents the validated primary triage category, S in [0, 100] is a dynamic multi-factor priority score, A is a set of canonical imperative action items, D contains ISO-8601 UTC-grounded deadlines, and r in {store, notify, monitor, label} denotes downstream routing directives - subject to strict local privacy constraints (AES-256-GCM zero-leakage persistence), sub-5 ms local inference latency for predictable emails, and zero data loss, such that the system achieves a multi-class triage Macro-F1 &gt;= 0.90 across all 15 categories, extracts action items and deadlines with an Exact Match F1 &gt;= 0.85, and offloads at least 65% of classification volume to a local CPU-bound calibrated linear classifier without degrading top-1 decision accuracy relative to a monolithic zero-shot frontier LLM baseline (Gemini / GPT-4), while guaranteeing 100% recall on critical academic examination and campus placement alerts.</w:t>
       </w:r>
     </w:p>
     <w:p>
@@ -3710,7 +3723,7 @@
                 <w:color w:val="2D3748"/>
                 <w:sz w:val="18"/>
               </w:rPr>
-              <w:t>Multi-field unstructured email payloads e = &lt;Subject, Body, Sender, Domain, ReceivedAt, Attachments&gt;, where |Body| &lt;= 50,000 characters, arriving incrementally via Gmail History API at burst volumes of 10–200 messages/hour.</w:t>
+              <w:t>Multi-field unstructured email payloads e = &lt;Subject, Body, Sender, Domain, ReceivedAt, Attachments&gt;, where |Body| &lt;= 50,000 characters, arriving incrementally via Gmail History API at burst volumes of 10-200 messages/hour.</w:t>
             </w:r>
           </w:p>
         </w:tc>
@@ -3784,7 +3797,7 @@
                 <w:color w:val="2D3748"/>
                 <w:sz w:val="18"/>
               </w:rPr>
-              <w:t>Structured Decision Tuple y = &lt;c*, S, A, D, r, tau_audit&gt;, where c* in C_15 is the primary category, S in [0, 100] is the priority score, A represents canonical action strings, D represents ISO-8601 UTC timestamps, r represents routing flags, and tau_audit is the cryptographic audit trace.</w:t>
+              <w:t>Structured Decision Tuple y = &lt;c*, S, A, D, r, tau_audit&gt;, where c* in 15 categories is the primary category, S in [0, 100] is the priority score, A represents canonical action strings, D represents ISO-8601 UTC timestamps, r represents routing flags, and tau_audit is the cryptographic audit trace.</w:t>
             </w:r>
           </w:p>
         </w:tc>
@@ -4399,7 +4412,7 @@
           <w:color w:val="2D3748"/>
           <w:sz w:val="20"/>
         </w:rPr>
-        <w:t>Unstructured string t in Sigma* generated via build_feature_text().</w:t>
+        <w:t>Unstructured string t generated via build_feature_text().</w:t>
       </w:r>
     </w:p>
     <w:p>
@@ -4628,7 +4641,7 @@
           <w:color w:val="2D3748"/>
           <w:sz w:val="20"/>
         </w:rPr>
-        <w:t xml:space="preserve">• Benchmark Datasets: </w:t>
+        <w:t xml:space="preserve">Benchmark Datasets: </w:t>
       </w:r>
       <w:r>
         <w:rPr>
@@ -4651,7 +4664,7 @@
           <w:color w:val="2D3748"/>
           <w:sz w:val="20"/>
         </w:rPr>
-        <w:t xml:space="preserve">• Split Strategy: </w:t>
+        <w:t xml:space="preserve">Split Strategy: </w:t>
       </w:r>
       <w:r>
         <w:rPr>
@@ -4674,7 +4687,7 @@
           <w:color w:val="2D3748"/>
           <w:sz w:val="20"/>
         </w:rPr>
-        <w:t xml:space="preserve">• Evaluation Metrics: </w:t>
+        <w:t xml:space="preserve">Evaluation Metrics: </w:t>
       </w:r>
       <w:r>
         <w:rPr>
@@ -4697,7 +4710,7 @@
           <w:color w:val="2D3748"/>
           <w:sz w:val="20"/>
         </w:rPr>
-        <w:t xml:space="preserve">• Baselines for Comparison: </w:t>
+        <w:t xml:space="preserve">Baselines for Comparison: </w:t>
       </w:r>
       <w:r>
         <w:rPr>
@@ -4720,7 +4733,7 @@
           <w:color w:val="2D3748"/>
           <w:sz w:val="20"/>
         </w:rPr>
-        <w:t xml:space="preserve">• Hardware &amp; Environment: </w:t>
+        <w:t xml:space="preserve">Hardware &amp; Environment: </w:t>
       </w:r>
       <w:r>
         <w:rPr>
@@ -4743,7 +4756,7 @@
           <w:color w:val="2D3748"/>
           <w:sz w:val="20"/>
         </w:rPr>
-        <w:t xml:space="preserve">• Planned Ablation Studies: </w:t>
+        <w:t xml:space="preserve">Planned Ablation Studies: </w:t>
       </w:r>
       <w:r>
         <w:rPr>
@@ -4808,7 +4821,7 @@
           <w:color w:val="2D3748"/>
           <w:sz w:val="20"/>
         </w:rPr>
-        <w:t>5.3 Estimated Training and Inference Time: Fitting the sublinear TF-IDF vectorizer and solving the balanced Logistic Regression objective requires less than 0.85 seconds on a standard quad-core CPU. Local ML prediction latency is 2.5 ms – 4.0 ms per email; deterministic rule evaluation requires &lt;1.0 ms; and escalated LLM inference (when triggered) requires 800 ms – 1,800 ms.</w:t>
+        <w:t>5.3 Estimated Training and Inference Time: Fitting the sublinear TF-IDF vectorizer and solving the balanced Logistic Regression objective requires less than 0.85 seconds on a standard quad-core CPU. Local ML prediction latency is 2.5 ms - 4.0 ms per email; deterministic rule evaluation requires &lt;1.0 ms; and escalated LLM inference (when triggered) requires 800 ms - 1,800 ms.</w:t>
       </w:r>
     </w:p>
     <w:p>
@@ -5417,419 +5430,7 @@
           <w:color w:val="1A365D"/>
           <w:sz w:val="26"/>
         </w:rPr>
-        <w:t>6. Project Contribution Matrix</w:t>
-      </w:r>
-    </w:p>
-    <w:tbl>
-      <w:tblPr>
-        <w:tblW w:type="auto" w:w="0"/>
-        <w:jc w:val="center"/>
-        <w:tblLayout w:type="fixed"/>
-        <w:tblLook w:firstColumn="1" w:firstRow="1" w:lastColumn="0" w:lastRow="0" w:noHBand="0" w:noVBand="1" w:val="04A0"/>
-        <w:tblBorders>
-          <w:top w:val="single" w:sz="4" w:space="0" w:color="CBD5E0"/>
-          <w:bottom w:val="single" w:sz="4" w:space="0" w:color="CBD5E0"/>
-          <w:left w:val="none"/>
-          <w:right w:val="none"/>
-          <w:insideH w:val="single" w:sz="4" w:space="0" w:color="CBD5E0"/>
-          <w:insideV w:val="none"/>
-        </w:tblBorders>
-      </w:tblPr>
-      <w:tblGrid>
-        <w:gridCol w:w="3120"/>
-        <w:gridCol w:w="3120"/>
-        <w:gridCol w:w="3120"/>
-      </w:tblGrid>
-      <w:tr>
-        <w:trPr>
-          <w:tblHeader/>
-          <w:cantSplit/>
-        </w:trPr>
-        <w:tc>
-          <w:tcPr>
-            <w:tcW w:type="dxa" w:w="2304"/>
-            <w:vAlign w:val="center"/>
-            <w:shd w:fill="1A365D"/>
-            <w:tcMar>
-              <w:top w:w="110" w:type="dxa"/>
-              <w:left w:w="110" w:type="dxa"/>
-              <w:bottom w:w="110" w:type="dxa"/>
-              <w:right w:w="110" w:type="dxa"/>
-            </w:tcMar>
-          </w:tcPr>
-          <w:p>
-            <w:pPr>
-              <w:spacing w:before="40" w:after="40"/>
-              <w:jc w:val="left"/>
-            </w:pPr>
-            <w:r>
-              <w:rPr>
-                <w:rFonts w:ascii="Calibri" w:hAnsi="Calibri"/>
-                <w:b/>
-                <w:color w:val="FFFFFF"/>
-                <w:sz w:val="19"/>
-              </w:rPr>
-              <w:t>Team Member / Contributor</w:t>
-            </w:r>
-          </w:p>
-        </w:tc>
-        <w:tc>
-          <w:tcPr>
-            <w:tcW w:type="dxa" w:w="3168"/>
-            <w:vAlign w:val="center"/>
-            <w:shd w:fill="1A365D"/>
-            <w:tcMar>
-              <w:top w:w="110" w:type="dxa"/>
-              <w:left w:w="110" w:type="dxa"/>
-              <w:bottom w:w="110" w:type="dxa"/>
-              <w:right w:w="110" w:type="dxa"/>
-            </w:tcMar>
-          </w:tcPr>
-          <w:p>
-            <w:pPr>
-              <w:spacing w:before="40" w:after="40"/>
-              <w:jc w:val="left"/>
-            </w:pPr>
-            <w:r>
-              <w:rPr>
-                <w:rFonts w:ascii="Calibri" w:hAnsi="Calibri"/>
-                <w:b/>
-                <w:color w:val="FFFFFF"/>
-                <w:sz w:val="19"/>
-              </w:rPr>
-              <w:t>Module / Subsystem Responsibility</w:t>
-            </w:r>
-          </w:p>
-        </w:tc>
-        <w:tc>
-          <w:tcPr>
-            <w:tcW w:type="dxa" w:w="3888"/>
-            <w:vAlign w:val="center"/>
-            <w:shd w:fill="1A365D"/>
-            <w:tcMar>
-              <w:top w:w="110" w:type="dxa"/>
-              <w:left w:w="110" w:type="dxa"/>
-              <w:bottom w:w="110" w:type="dxa"/>
-              <w:right w:w="110" w:type="dxa"/>
-            </w:tcMar>
-          </w:tcPr>
-          <w:p>
-            <w:pPr>
-              <w:spacing w:before="40" w:after="40"/>
-              <w:jc w:val="left"/>
-            </w:pPr>
-            <w:r>
-              <w:rPr>
-                <w:rFonts w:ascii="Calibri" w:hAnsi="Calibri"/>
-                <w:b/>
-                <w:color w:val="FFFFFF"/>
-                <w:sz w:val="19"/>
-              </w:rPr>
-              <w:t>Specific Technical Deliverables &amp; Commits</w:t>
-            </w:r>
-          </w:p>
-        </w:tc>
-      </w:tr>
-      <w:tr>
-        <w:trPr>
-          <w:cantSplit/>
-        </w:trPr>
-        <w:tc>
-          <w:tcPr>
-            <w:tcW w:type="dxa" w:w="2304"/>
-            <w:vAlign w:val="center"/>
-            <w:shd w:fill="FFFFFF"/>
-            <w:tcMar>
-              <w:top w:w="80" w:type="dxa"/>
-              <w:left w:w="110" w:type="dxa"/>
-              <w:bottom w:w="80" w:type="dxa"/>
-              <w:right w:w="110" w:type="dxa"/>
-            </w:tcMar>
-          </w:tcPr>
-          <w:p>
-            <w:pPr>
-              <w:spacing w:before="20" w:after="20" w:line="264" w:lineRule="auto"/>
-              <w:jc w:val="left"/>
-            </w:pPr>
-            <w:r>
-              <w:rPr>
-                <w:rFonts w:ascii="Calibri" w:hAnsi="Calibri"/>
-                <w:color w:val="2D3748"/>
-                <w:sz w:val="18"/>
-              </w:rPr>
-            </w:r>
-            <w:r>
-              <w:rPr>
-                <w:rFonts w:ascii="Calibri" w:hAnsi="Calibri"/>
-                <w:b/>
-                <w:color w:val="2D3748"/>
-                <w:sz w:val="18"/>
-              </w:rPr>
-              <w:t>S. MIRTTUL</w:t>
-            </w:r>
-            <w:r>
-              <w:rPr>
-                <w:rFonts w:ascii="Calibri" w:hAnsi="Calibri"/>
-                <w:color w:val="2D3748"/>
-                <w:sz w:val="18"/>
-              </w:rPr>
-              <w:br/>
-              <w:t xml:space="preserve">(Roll No.: </w:t>
-            </w:r>
-            <w:r>
-              <w:rPr>
-                <w:rFonts w:ascii="Calibri" w:hAnsi="Calibri"/>
-                <w:b/>
-                <w:color w:val="2D3748"/>
-                <w:sz w:val="18"/>
-              </w:rPr>
-              <w:t>24BRS1428</w:t>
-            </w:r>
-            <w:r>
-              <w:rPr>
-                <w:rFonts w:ascii="Calibri" w:hAnsi="Calibri"/>
-                <w:color w:val="2D3748"/>
-                <w:sz w:val="18"/>
-              </w:rPr>
-              <w:t>)</w:t>
-            </w:r>
-          </w:p>
-        </w:tc>
-        <w:tc>
-          <w:tcPr>
-            <w:tcW w:type="dxa" w:w="3168"/>
-            <w:vAlign w:val="center"/>
-            <w:shd w:fill="FFFFFF"/>
-            <w:tcMar>
-              <w:top w:w="80" w:type="dxa"/>
-              <w:left w:w="110" w:type="dxa"/>
-              <w:bottom w:w="80" w:type="dxa"/>
-              <w:right w:w="110" w:type="dxa"/>
-            </w:tcMar>
-          </w:tcPr>
-          <w:p>
-            <w:pPr>
-              <w:spacing w:before="20" w:after="20" w:line="264" w:lineRule="auto"/>
-              <w:jc w:val="left"/>
-            </w:pPr>
-            <w:r>
-              <w:rPr>
-                <w:rFonts w:ascii="Calibri" w:hAnsi="Calibri"/>
-                <w:color w:val="2D3748"/>
-                <w:sz w:val="18"/>
-              </w:rPr>
-            </w:r>
-            <w:r>
-              <w:rPr>
-                <w:rFonts w:ascii="Calibri" w:hAnsi="Calibri"/>
-                <w:b/>
-                <w:color w:val="2D3748"/>
-                <w:sz w:val="18"/>
-              </w:rPr>
-              <w:t>Multi-Agent Orchestration, Machine Learning Pipeline, &amp; Evaluation Framework</w:t>
-            </w:r>
-            <w:r>
-              <w:rPr>
-                <w:rFonts w:ascii="Calibri" w:hAnsi="Calibri"/>
-                <w:color w:val="2D3748"/>
-                <w:sz w:val="18"/>
-              </w:rPr>
-            </w:r>
-          </w:p>
-        </w:tc>
-        <w:tc>
-          <w:tcPr>
-            <w:tcW w:type="dxa" w:w="3888"/>
-            <w:vAlign w:val="center"/>
-            <w:shd w:fill="FFFFFF"/>
-            <w:tcMar>
-              <w:top w:w="80" w:type="dxa"/>
-              <w:left w:w="110" w:type="dxa"/>
-              <w:bottom w:w="80" w:type="dxa"/>
-              <w:right w:w="110" w:type="dxa"/>
-            </w:tcMar>
-          </w:tcPr>
-          <w:p>
-            <w:pPr>
-              <w:spacing w:before="20" w:after="20" w:line="264" w:lineRule="auto"/>
-              <w:jc w:val="left"/>
-            </w:pPr>
-            <w:r>
-              <w:rPr>
-                <w:rFonts w:ascii="Calibri" w:hAnsi="Calibri"/>
-                <w:color w:val="2D3748"/>
-                <w:sz w:val="18"/>
-              </w:rPr>
-              <w:t>• Designed &amp; implemented deterministic AMAROrchestrator conflict resolution matrix and domain precedence rules.</w:t>
-              <w:br/>
-              <w:t>• Engineered cascaded TriageAgent (sublinear TF-IDF + calibrated Logistic Regression with C=30.0, confidence gating tau &gt;= 0.70, and structured LLM fallback).</w:t>
-              <w:br/>
-              <w:t>• Implemented ActionAgent imperative verb parser and DeadlineAgent relative temporal resolution to ISO-8601 UTC timestamps.</w:t>
-              <w:br/>
-              <w:t>• Formulated mathematical equations, loss calibration, and developed offline benchmark evaluation suite (evaluate.py, training.py).</w:t>
-              <w:br/>
-              <w:t>• Conducted 15-class experimental ablation studies and wrote DA1 problem formalization and literature survey comparison.</w:t>
-            </w:r>
-          </w:p>
-        </w:tc>
-      </w:tr>
-      <w:tr>
-        <w:trPr>
-          <w:cantSplit/>
-        </w:trPr>
-        <w:tc>
-          <w:tcPr>
-            <w:tcW w:type="dxa" w:w="2304"/>
-            <w:vAlign w:val="center"/>
-            <w:shd w:fill="F7FAFC"/>
-            <w:tcMar>
-              <w:top w:w="80" w:type="dxa"/>
-              <w:left w:w="110" w:type="dxa"/>
-              <w:bottom w:w="80" w:type="dxa"/>
-              <w:right w:w="110" w:type="dxa"/>
-            </w:tcMar>
-          </w:tcPr>
-          <w:p>
-            <w:pPr>
-              <w:spacing w:before="20" w:after="20" w:line="264" w:lineRule="auto"/>
-              <w:jc w:val="left"/>
-            </w:pPr>
-            <w:r>
-              <w:rPr>
-                <w:rFonts w:ascii="Calibri" w:hAnsi="Calibri"/>
-                <w:color w:val="2D3748"/>
-                <w:sz w:val="18"/>
-              </w:rPr>
-            </w:r>
-            <w:r>
-              <w:rPr>
-                <w:rFonts w:ascii="Calibri" w:hAnsi="Calibri"/>
-                <w:b/>
-                <w:color w:val="2D3748"/>
-                <w:sz w:val="18"/>
-              </w:rPr>
-              <w:t>ADITYA SRIKANTH</w:t>
-            </w:r>
-            <w:r>
-              <w:rPr>
-                <w:rFonts w:ascii="Calibri" w:hAnsi="Calibri"/>
-                <w:color w:val="2D3748"/>
-                <w:sz w:val="18"/>
-              </w:rPr>
-              <w:br/>
-              <w:t xml:space="preserve">(Roll No.: </w:t>
-            </w:r>
-            <w:r>
-              <w:rPr>
-                <w:rFonts w:ascii="Calibri" w:hAnsi="Calibri"/>
-                <w:b/>
-                <w:color w:val="2D3748"/>
-                <w:sz w:val="18"/>
-              </w:rPr>
-              <w:t>24BRS1437</w:t>
-            </w:r>
-            <w:r>
-              <w:rPr>
-                <w:rFonts w:ascii="Calibri" w:hAnsi="Calibri"/>
-                <w:color w:val="2D3748"/>
-                <w:sz w:val="18"/>
-              </w:rPr>
-              <w:t>)</w:t>
-            </w:r>
-          </w:p>
-        </w:tc>
-        <w:tc>
-          <w:tcPr>
-            <w:tcW w:type="dxa" w:w="3168"/>
-            <w:vAlign w:val="center"/>
-            <w:shd w:fill="F7FAFC"/>
-            <w:tcMar>
-              <w:top w:w="80" w:type="dxa"/>
-              <w:left w:w="110" w:type="dxa"/>
-              <w:bottom w:w="80" w:type="dxa"/>
-              <w:right w:w="110" w:type="dxa"/>
-            </w:tcMar>
-          </w:tcPr>
-          <w:p>
-            <w:pPr>
-              <w:spacing w:before="20" w:after="20" w:line="264" w:lineRule="auto"/>
-              <w:jc w:val="left"/>
-            </w:pPr>
-            <w:r>
-              <w:rPr>
-                <w:rFonts w:ascii="Calibri" w:hAnsi="Calibri"/>
-                <w:color w:val="2D3748"/>
-                <w:sz w:val="18"/>
-              </w:rPr>
-            </w:r>
-            <w:r>
-              <w:rPr>
-                <w:rFonts w:ascii="Calibri" w:hAnsi="Calibri"/>
-                <w:b/>
-                <w:color w:val="2D3748"/>
-                <w:sz w:val="18"/>
-              </w:rPr>
-              <w:t>Data Ingestion, Cryptographic Security, Priority Engine, &amp; Client Delivery</w:t>
-            </w:r>
-            <w:r>
-              <w:rPr>
-                <w:rFonts w:ascii="Calibri" w:hAnsi="Calibri"/>
-                <w:color w:val="2D3748"/>
-                <w:sz w:val="18"/>
-              </w:rPr>
-            </w:r>
-          </w:p>
-        </w:tc>
-        <w:tc>
-          <w:tcPr>
-            <w:tcW w:type="dxa" w:w="3888"/>
-            <w:vAlign w:val="center"/>
-            <w:shd w:fill="F7FAFC"/>
-            <w:tcMar>
-              <w:top w:w="80" w:type="dxa"/>
-              <w:left w:w="110" w:type="dxa"/>
-              <w:bottom w:w="80" w:type="dxa"/>
-              <w:right w:w="110" w:type="dxa"/>
-            </w:tcMar>
-          </w:tcPr>
-          <w:p>
-            <w:pPr>
-              <w:spacing w:before="20" w:after="20" w:line="264" w:lineRule="auto"/>
-              <w:jc w:val="left"/>
-            </w:pPr>
-            <w:r>
-              <w:rPr>
-                <w:rFonts w:ascii="Calibri" w:hAnsi="Calibri"/>
-                <w:color w:val="2D3748"/>
-                <w:sz w:val="18"/>
-              </w:rPr>
-              <w:t>• Engineered MailIntakeAgent for RFC 2822 MIME parsing, HTML tag stripping, Unicode NFKC normalization, and PII/credential redaction.</w:t>
-              <w:br/>
-              <w:t>• Developed GmailSyncService integrating Google OAuth 2.0 and incremental Gmail History API sync with stateful historyId baselining.</w:t>
-              <w:br/>
-              <w:t>• Designed transparent AES-256-GCM data-at-rest encryption layer and SHA-256 tamper-evident append-only audit ledger.</w:t>
-              <w:br/>
-              <w:t>• Implemented PriorityAgent context weighting, MonitorScheduler asynchronous cron loops, and multi-tier deadline escalation ladder (NORMAL -&gt; REMINDER -&gt; URGENT -&gt; ALARM).</w:t>
-              <w:br/>
-              <w:t>• Built Firebase Cloud Messaging (FCM) background push service and developed cross-platform Flutter client UI application.</w:t>
-            </w:r>
-          </w:p>
-        </w:tc>
-      </w:tr>
-    </w:tbl>
-    <w:p>
-      <w:pPr>
-        <w:keepNext/>
-        <w:spacing w:before="260" w:after="60"/>
-      </w:pPr>
-      <w:r>
-        <w:rPr>
-          <w:rFonts w:ascii="Calibri" w:hAnsi="Calibri"/>
-          <w:b/>
-          <w:color w:val="1A365D"/>
-          <w:sz w:val="26"/>
-        </w:rPr>
-        <w:t>7. References</w:t>
+        <w:t>6. References</w:t>
       </w:r>
     </w:p>
     <w:p>
@@ -5842,7 +5443,7 @@
           <w:color w:val="2D3748"/>
           <w:sz w:val="18"/>
         </w:rPr>
-        <w:t>1. S. Srivastava, G. Singh, S. Matsumoto, A. Raz, P. Costa, J. Poore, and Z. Yao, 'MailEx: Email Event and Argument Extraction,' in Proceedings of the 2023 Conference on Empirical Methods in Natural Language Processing (EMNLP), Singapore, Dec. 2023, pp. 6124–6139.</w:t>
+        <w:t>1. S. Srivastava, G. Singh, S. Matsumoto, A. Raz, P. Costa, J. Poore, and Z. Yao, 'MailEx: Email Event and Argument Extraction,' in Proceedings of the 2023 Conference on Empirical Methods in Natural Language Processing (EMNLP), Singapore, Dec. 2023, pp. 6124-6139.</w:t>
       </w:r>
     </w:p>
     <w:p>
@@ -5855,7 +5456,7 @@
           <w:color w:val="2D3748"/>
           <w:sz w:val="18"/>
         </w:rPr>
-        <w:t>2. Q. Wu, G. Bansal, J. Zhang, Y. Wu, B. Li, E. Zhu, L. Jiang, X. Zhang, S. Zhang, J. Liu, A. H. Awadallah, R. W. White, D. Burger, and H. Wang, 'AutoGen: Enabling Next-Gen LLM Applications via Multi-Agent Conversation,' in Advances in Neural Information Processing Systems (NeurIPS), vol. 36, New Orleans, LA, Dec. 2023, pp. 24876–24893.</w:t>
+        <w:t>2. Q. Wu, G. Bansal, J. Zhang, Y. Wu, B. Li, E. Zhu, L. Jiang, X. Zhang, S. Zhang, J. Liu, A. H. Awadallah, R. W. White, D. Burger, and H. Wang, 'AutoGen: Enabling Next-Gen LLM Applications via Multi-Agent Conversation,' in Advances in Neural Information Processing Systems (NeurIPS), vol. 36, New Orleans, LA, Dec. 2023, pp. 24876-24893.</w:t>
       </w:r>
     </w:p>
     <w:p>
@@ -5868,7 +5469,7 @@
           <w:color w:val="2D3748"/>
           <w:sz w:val="18"/>
         </w:rPr>
-        <w:t>3. L. Chen, M. Zaharia, and J. Zou, 'FrugalGPT: How to Use Large Language Models More Cheaply and More Accurately,' in Advances in Neural Information Processing Systems (NeurIPS), vol. 36, Dec. 2023, pp. 78321–78345.</w:t>
+        <w:t>3. L. Chen, M. Zaharia, and J. Zou, 'FrugalGPT: How to Use Large Language Models More Cheaply and More Accurately,' in Advances in Neural Information Processing Systems (NeurIPS), vol. 36, Dec. 2023, pp. 78321-78345.</w:t>
       </w:r>
     </w:p>
     <w:p>
@@ -5881,7 +5482,7 @@
           <w:color w:val="2D3748"/>
           <w:sz w:val="18"/>
         </w:rPr>
-        <w:t>4. C. Qian, X. Dang, C. Zhuang, Y. Wei, W. Chen, C. Lin, and M. Sun, 'Communicative Agents for Software Development,' in Proceedings of the 62nd Annual Meeting of the Association for Computational Linguistics (ACL), Bangkok, Thailand, Aug. 2024, pp. 1287–1304.</w:t>
+        <w:t>4. C. Qian, X. Dang, C. Zhuang, Y. Wei, W. Chen, C. Lin, and M. Sun, 'Communicative Agents for Software Development,' in Proceedings of the 62nd Annual Meeting of the Association for Computational Linguistics (ACL), Bangkok, Thailand, Aug. 2024, pp. 1287-1304.</w:t>
       </w:r>
     </w:p>
     <w:p>
@@ -5907,7 +5508,7 @@
           <w:color w:val="2D3748"/>
           <w:sz w:val="18"/>
         </w:rPr>
-        <w:t>6. A. S. Al-Ghamdi and M. A. Al-Hagery, 'A Robust Hybrid Deep Learning Model for Email Classification and Phishing Detection,' IEEE Access, vol. 11, pp. 84210–84224, Aug. 2023.</w:t>
+        <w:t>6. A. S. Al-Ghamdi and M. A. Al-Hagery, 'A Robust Hybrid Deep Learning Model for Email Classification and Phishing Detection,' IEEE Access, vol. 11, pp. 84210-84224, Aug. 2023.</w:t>
       </w:r>
     </w:p>
     <w:p>
@@ -5920,7 +5521,7 @@
           <w:color w:val="2D3748"/>
           <w:sz w:val="18"/>
         </w:rPr>
-        <w:t>7. E. Laparra, D. Bethard, and S. Styler, 'Neural Temporal Relation Extraction and Normalization in Free-Form Text,' Transactions of the Association for Computational Linguistics (TACL), vol. 11, pp. 312–328, Apr. 2023.</w:t>
+        <w:t>7. E. Laparra, D. Bethard, and S. Styler, 'Neural Temporal Relation Extraction and Normalization in Free-Form Text,' Transactions of the Association for Computational Linguistics (TACL), vol. 11, pp. 312-328, Apr. 2023.</w:t>
       </w:r>
     </w:p>
     <w:p>
@@ -5933,7 +5534,7 @@
           <w:color w:val="2D3748"/>
           <w:sz w:val="18"/>
         </w:rPr>
-        <w:t>8. Y. Zhang, H. Liu, and K. Chen, 'Dynamic Priority Assessment and Multi-Criteria Task Scheduling for Asynchronous Personal Messages,' Springer Neural Computing and Applications, vol. 36, no. 8, pp. 4125–4142, Feb. 2024.</w:t>
+        <w:t>8. Y. Zhang, H. Liu, and K. Chen, 'Dynamic Priority Assessment and Multi-Criteria Task Scheduling for Asynchronous Personal Messages,' Springer Neural Computing and Applications, vol. 36, no. 8, pp. 4125-4142, Feb. 2024.</w:t>
       </w:r>
     </w:p>
     <w:p>
@@ -5946,7 +5547,7 @@
           <w:color w:val="2D3748"/>
           <w:sz w:val="18"/>
         </w:rPr>
-        <w:t>9. X. Wang, T. He, and Z. Zhang, 'Hierarchical Multi-Label Attention Networks for Enterprise Email Triage and Action Item Identification,' IEEE Transactions on Computational Social Systems, vol. 11, no. 2, pp. 2145–2158, Apr. 2024.</w:t>
+        <w:t>9. X. Wang, T. He, and Z. Zhang, 'Hierarchical Multi-Label Attention Networks for Enterprise Email Triage and Action Item Identification,' IEEE Transactions on Computational Social Systems, vol. 11, no. 2, pp. 2145-2158, Apr. 2024.</w:t>
       </w:r>
     </w:p>
     <w:p>
@@ -5959,7 +5560,7 @@
           <w:color w:val="2D3748"/>
           <w:sz w:val="18"/>
         </w:rPr>
-        <w:t>10. J. Su, D. Zhou, and H. Zhao, 'Grounding Relative Temporal Expressions in Conversational Texts: A Neuro-Symbolic Approach,' in Proceedings of the 2024 Joint International Conference on Computational Linguistics, Language Resources and Evaluation (LREC-COLING), Turin, Italy, May 2024, pp. 4512–4523.</w:t>
+        <w:t>10. J. Su, D. Zhou, and H. Zhao, 'Grounding Relative Temporal Expressions in Conversational Texts: A Neuro-Symbolic Approach,' in Proceedings of the 2024 Joint International Conference on Computational Linguistics, Language Resources and Evaluation (LREC-COLING), Turin, Italy, May 2024, pp. 4512-4523.</w:t>
       </w:r>
     </w:p>
     <w:p>
@@ -5972,7 +5573,7 @@
           <w:color w:val="2D3748"/>
           <w:sz w:val="18"/>
         </w:rPr>
-        <w:t>11. Z. Chen, Y. Shen, and M. Zaharia, 'Model Cascades with Calibrated Confidence Scores for Latency-Sensitive NLP Services,' in Proceedings of the 41st International Conference on Machine Learning (ICML), Vienna, Austria, Jul. 2024, pp. 7120–7139.</w:t>
+        <w:t>11. Z. Chen, Y. Shen, and M. Zaharia, 'Model Cascades with Calibrated Confidence Scores for Latency-Sensitive NLP Services,' in Proceedings of the 41st International Conference on Machine Learning (ICML), Vienna, Austria, Jul. 2024, pp. 7120-7139.</w:t>
       </w:r>
     </w:p>
     <w:p>
@@ -5985,7 +5586,7 @@
           <w:color w:val="2D3748"/>
           <w:sz w:val="18"/>
         </w:rPr>
-        <w:t>12. J. Park and S. Kim, 'Personalized Email Prioritization via User Interaction Graph and Content Modeling,' ACM Transactions on Information Systems (TOIS), vol. 42, no. 1, pp. 1–28, Jan. 2024.</w:t>
+        <w:t>12. J. Park and S. Kim, 'Personalized Email Prioritization via User Interaction Graph and Content Modeling,' ACM Transactions on Information Systems (TOIS), vol. 42, no. 1, pp. 1-28, Jan. 2024.</w:t>
       </w:r>
     </w:p>
     <w:p>
@@ -5998,7 +5599,7 @@
           <w:color w:val="2D3748"/>
           <w:sz w:val="18"/>
         </w:rPr>
-        <w:t>13. M. Devlin and T. Liu, 'Automated Action Item Extraction from Professional Dialogues: A Comparative Study of LLMs versus Specialized Supervised Models,' Springer Knowledge and Information Systems, vol. 65, no. 11, pp. 4821–4845, Nov. 2023.</w:t>
+        <w:t>13. M. Devlin and T. Liu, 'Automated Action Item Extraction from Professional Dialogues: A Comparative Study of LLMs versus Specialized Supervised Models,' Springer Knowledge and Information Systems, vol. 65, no. 11, pp. 4821-4845, Nov. 2023.</w:t>
       </w:r>
     </w:p>
     <w:p>
@@ -6011,7 +5612,7 @@
           <w:color w:val="2D3748"/>
           <w:sz w:val="18"/>
         </w:rPr>
-        <w:t>14. G. Mark, S. T. Iqbal, and M. Czerwinski, 'The Cost of Interrupted Work: An Empirical Analysis of Digital Communication Overload and Cognitive Fatigue,' in Proceedings of the 2022 ACM Conference on Human Factors in Computing Systems (CHI), New Orleans, LA, May 2022, pp. 1–16.</w:t>
+        <w:t>14. G. Mark, S. T. Iqbal, and M. Czerwinski, 'The Cost of Interrupted Work: An Empirical Analysis of Digital Communication Overload and Cognitive Fatigue,' in Proceedings of the 2022 ACM Conference on Human Factors in Computing Systems (CHI), New Orleans, LA, May 2022, pp. 1-16.</w:t>
       </w:r>
     </w:p>
     <w:p>
@@ -6024,7 +5625,7 @@
           <w:color w:val="2D3748"/>
           <w:sz w:val="18"/>
         </w:rPr>
-        <w:t>15. A. Radford and P. Narasimhan, 'Secure and Private Machine Learning for Edge-Cloud Collaborative Communication Systems,' IEEE Transactions on Big Data, vol. 10, no. 4, pp. 412–426, Aug. 2024.</w:t>
+        <w:t>15. A. Radford and P. Narasimhan, 'Secure and Private Machine Learning for Edge-Cloud Collaborative Communication Systems,' IEEE Transactions on Big Data, vol. 10, no. 4, pp. 412-426, Aug. 2024.</w:t>
       </w:r>
     </w:p>
     <w:p>
@@ -6057,21 +5658,62 @@
   <w:p>
     <w:pPr>
       <w:pStyle w:val="Footer"/>
-      <w:jc w:val="left"/>
     </w:pPr>
-    <w:r>
-      <w:rPr>
-        <w:rFonts w:ascii="Calibri" w:hAnsi="Calibri"/>
-        <w:color w:val="718096"/>
-        <w:sz w:val="17"/>
-      </w:rPr>
-      <w:t>AGENT AMAR | S. MIRTTUL (24BRS1428) &amp; ADITYA SRIKANTH (24BRS1437)</w:t>
-      <w:tab/>
-      <w:tab/>
-      <w:t xml:space="preserve">Page </w:t>
-    </w:r>
-    <w:fldSimple w:instr="PAGE"/>
+    <w:r/>
   </w:p>
+  <w:tbl>
+    <w:tblPr>
+      <w:tblW w:type="auto" w:w="0"/>
+      <w:jc w:val="center"/>
+      <w:tblLayout w:type="fixed"/>
+      <w:tblLook w:firstColumn="1" w:firstRow="1" w:lastColumn="0" w:lastRow="0" w:noHBand="0" w:noVBand="1" w:val="04A0"/>
+    </w:tblPr>
+    <w:tblGrid>
+      <w:gridCol w:w="4680"/>
+      <w:gridCol w:w="4680"/>
+    </w:tblGrid>
+    <w:tr>
+      <w:tc>
+        <w:tcPr>
+          <w:tcW w:type="dxa" w:w="6912"/>
+        </w:tcPr>
+        <w:p>
+          <w:pPr>
+            <w:spacing w:before="0" w:after="0"/>
+            <w:jc w:val="left"/>
+          </w:pPr>
+          <w:r>
+            <w:rPr>
+              <w:rFonts w:ascii="Calibri" w:hAnsi="Calibri"/>
+              <w:color w:val="718096"/>
+              <w:sz w:val="17"/>
+            </w:rPr>
+            <w:t>AGENT AMAR | S. MIRTTUL (24BRS1428) &amp; ADITYA SRIKANTH (24BRS1437)</w:t>
+          </w:r>
+        </w:p>
+      </w:tc>
+      <w:tc>
+        <w:tcPr>
+          <w:tcW w:type="dxa" w:w="2448"/>
+        </w:tcPr>
+        <w:p>
+          <w:pPr>
+            <w:spacing w:before="0" w:after="0"/>
+            <w:jc w:val="right"/>
+          </w:pPr>
+          <w:r>
+            <w:rPr>
+              <w:rFonts w:ascii="Calibri" w:hAnsi="Calibri"/>
+              <w:color w:val="718096"/>
+              <w:sz w:val="17"/>
+            </w:rPr>
+            <w:t xml:space="preserve">Page </w:t>
+          </w:r>
+          <w:fldSimple w:instr="PAGE"/>
+        </w:p>
+      </w:tc>
+    </w:tr>
+  </w:tbl>
 </w:ftr>
 </file>
 
@@ -6089,7 +5731,7 @@
         <w:color w:val="718096"/>
         <w:sz w:val="17"/>
       </w:rPr>
-      <w:t>COURSE MINI PROJECT — REVIEW 1 REPORT (DA1)</w:t>
+      <w:t>COURSE MINI PROJECT - REVIEW 1 REPORT (DA1)</w:t>
     </w:r>
   </w:p>
 </w:hdr>

</xml_diff>